<commit_message>
Clarify Copart weather linkage and competition submission gaps
</commit_message>
<xml_diff>
--- a/docs/copart-research-report.docx
+++ b/docs/copart-research-report.docx
@@ -35,7 +35,7 @@
           <w:color w:val="7F4B35"/>
           <w:sz w:val="16"/>
         </w:rPr>
-        <w:t>AI-assisted research draft. The team must independently author final submission text under the competition rules.</w:t>
+        <w:t>Not submission-ready. Rules allow disclosed initial AI research but prohibit generative-AI submission content, in whole or part. This includes more than prose; Python generation does not itself establish eligibility.</w:t>
       </w:r>
     </w:p>
     <w:p>
@@ -85,7 +85,7 @@
           <w:b w:val="0"/>
           <w:color w:val="895824"/>
         </w:rPr>
-        <w:t>[Steven: Add cited competitive and customer-retention evidence, management assessment, the strongest alternative explanation, and why the evidence favors the thesis.]</w:t>
+        <w:t>[Steven: Add a relevant industry overview, competitive strengths and weaknesses, customer-retention evidence, and management assessment. Cite public sources and address the strongest competing explanation.]</w:t>
       </w:r>
     </w:p>
     <w:p>
@@ -174,7 +174,16 @@
           <w:b w:val="0"/>
           <w:sz w:val="18"/>
         </w:rPr>
-        <w:t>NOAA records show different patterns by event type. These exhibits provide context; neither establishes an effect on Copart’s vehicle volumes or earnings. The four annual workbook observations cannot support the planned predictive test without longer financial history.</w:t>
+        <w:t>Proposed Copart connection: damaging weather may increase insured total-loss vehicles, some of which may be assigned to Copart and subsequently sold. Assignment share, auction timing, fees and handling costs determine the financial effect. This is a hypothesis to test, not an estimated relationship.</w:t>
+      </w:r>
+    </w:p>
+    <w:p>
+      <w:r>
+        <w:rPr>
+          <w:b w:val="0"/>
+          <w:sz w:val="18"/>
+        </w:rPr>
+        <w:t>The figure describes historical U.S. weather records aligned to Copart’s fiscal calendar. It does not forecast future weather or establish changes in Copart revenue, volumes or earnings. It is not weighted by Copart’s footprint or insured-vehicle exposure, and it does not represent all catastrophe types or international operations.</w:t>
       </w:r>
     </w:p>
     <w:p>
@@ -227,62 +236,13 @@
       </w:r>
     </w:p>
     <w:p>
-      <w:pPr>
-        <w:spacing w:after="20"/>
-        <w:jc w:val="center"/>
-      </w:pPr>
-      <w:r>
-        <w:drawing>
-          <wp:inline xmlns:a="http://schemas.openxmlformats.org/drawingml/2006/main" xmlns:pic="http://schemas.openxmlformats.org/drawingml/2006/picture">
-            <wp:extent cx="6080760" cy="2787015"/>
-            <wp:docPr id="2" name="Picture 2" descr="Monthly hail, flash-flood and flood record seasonality across 2010 to 2025, with median curves and interquartile bands."/>
-            <wp:cNvGraphicFramePr>
-              <a:graphicFrameLocks noChangeAspect="1"/>
-            </wp:cNvGraphicFramePr>
-            <a:graphic>
-              <a:graphicData uri="http://schemas.openxmlformats.org/drawingml/2006/picture">
-                <pic:pic>
-                  <pic:nvPicPr>
-                    <pic:cNvPr id="0" name="02-weather-seasonality.png"/>
-                    <pic:cNvPicPr/>
-                  </pic:nvPicPr>
-                  <pic:blipFill>
-                    <a:blip r:embed="rId10"/>
-                    <a:stretch>
-                      <a:fillRect/>
-                    </a:stretch>
-                  </pic:blipFill>
-                  <pic:spPr>
-                    <a:xfrm>
-                      <a:off x="0" y="0"/>
-                      <a:ext cx="6080760" cy="2787015"/>
-                    </a:xfrm>
-                    <a:prstGeom prst="rect"/>
-                  </pic:spPr>
-                </pic:pic>
-              </a:graphicData>
-            </a:graphic>
-          </wp:inline>
-        </w:drawing>
-      </w:r>
-    </w:p>
-    <w:p>
-      <w:r>
-        <w:rPr>
-          <w:b w:val="0"/>
-          <w:sz w:val="16"/>
-        </w:rPr>
-        <w:t>Figure 2. Seasonal medians and middle 50% across years. Seasonality must be controlled before attributing predictive value to weather.</w:t>
-      </w:r>
-    </w:p>
-    <w:p>
       <w:r>
         <w:rPr>
           <w:b w:val="0"/>
           <w:color w:val="895824"/>
           <w:sz w:val="16"/>
         </w:rPr>
-        <w:t>[After validation: add forecast target, sample/test periods, baseline error and weather-model error. No validated Copart weather forecast is available yet.]</w:t>
+        <w:t>[Predictive evidence: justify forward business assumptions in the separate financial model and explain their valuation impact. If adding a weather prediction, report the target, test periods and error versus a baseline. Four annual observations are insufficient for the planned weather evaluation; no weather earnings uplift is validated.]</w:t>
       </w:r>
     </w:p>
     <w:p>
@@ -294,8 +254,17 @@
         <w:t>Source: NOAA Storm Events revised 2010–2025 snapshots, U.S. states/DC; ncei.noaa.gov/pub/data/swdi/stormevents/csvfiles/. Figures are the original Python-generated PNGs. Counts are event records, not unique storms or insured losses. Historical publication vintages are not reconstructed.</w:t>
       </w:r>
     </w:p>
+    <w:p>
+      <w:r>
+        <w:rPr>
+          <w:b w:val="0"/>
+          <w:sz w:val="16"/>
+        </w:rPr>
+        <w:t>Submission format: final team-authored memorandum must be PDF, at most two pages including any appendix, with a separate Excel valuation model. DOCX is an editing format. Pagination has not been verified. All sources must be cited and initial AI research disclosed to the sponsor.</w:t>
+      </w:r>
+    </w:p>
     <w:sectPr>
-      <w:footerReference w:type="default" r:id="rId11"/>
+      <w:footerReference w:type="default" r:id="rId10"/>
       <w:pgSz w:w="12240" w:h="15840"/>
       <w:pgMar w:top="864" w:right="1008" w:bottom="864" w:left="1008" w:header="720" w:footer="360" w:gutter="0"/>
       <w:cols w:space="720"/>

</xml_diff>

<commit_message>
Simplify report weather chart and add methodology
</commit_message>
<xml_diff>
--- a/docs/copart-research-report.docx
+++ b/docs/copart-research-report.docx
@@ -194,8 +194,8 @@
       <w:r>
         <w:drawing>
           <wp:inline xmlns:a="http://schemas.openxmlformats.org/drawingml/2006/main" xmlns:pic="http://schemas.openxmlformats.org/drawingml/2006/picture">
-            <wp:extent cx="5166360" cy="4090035"/>
-            <wp:docPr id="1" name="Picture 1" descr="Historical weather distributions with FY2025 highlighted. All four flash-flood quarters exceed their median; three hail and flood quarters are below."/>
+            <wp:extent cx="5577840" cy="4685386"/>
+            <wp:docPr id="1" name="Picture 1" descr="Three horizontal bar charts show FY2025 weather deviations. All four flash-flood quarters are above median; three hail and flood quarters are below. Calendar months label each quarter."/>
             <wp:cNvGraphicFramePr>
               <a:graphicFrameLocks noChangeAspect="1"/>
             </wp:cNvGraphicFramePr>
@@ -203,7 +203,7 @@
               <a:graphicData uri="http://schemas.openxmlformats.org/drawingml/2006/picture">
                 <pic:pic>
                   <pic:nvPicPr>
-                    <pic:cNvPr id="0" name="04-editorial-weather-distribution.png"/>
+                    <pic:cNvPr id="0" name="05-simple-weather-comparison.png"/>
                     <pic:cNvPicPr/>
                   </pic:nvPicPr>
                   <pic:blipFill>
@@ -215,7 +215,7 @@
                   <pic:spPr>
                     <a:xfrm>
                       <a:off x="0" y="0"/>
-                      <a:ext cx="5166360" cy="4090035"/>
+                      <a:ext cx="5577840" cy="4685386"/>
                     </a:xfrm>
                     <a:prstGeom prst="rect"/>
                   </pic:spPr>
@@ -232,7 +232,24 @@
           <w:b w:val="0"/>
           <w:sz w:val="16"/>
         </w:rPr>
-        <w:t>Figure 1. FY2025 quarters against historical same-quarter medians. Full-sample comparison, not a point-in-time backtest.</w:t>
+        <w:t>Figure 1. FY2025 weather records versus seasonal medians. Zero means the historical median; positive bars mean more records, negative bars fewer.</w:t>
+      </w:r>
+    </w:p>
+    <w:p>
+      <w:pPr>
+        <w:pStyle w:val="Heading1"/>
+      </w:pPr>
+      <w:r>
+        <w:t>Methodology</w:t>
+      </w:r>
+    </w:p>
+    <w:p>
+      <w:r>
+        <w:rPr>
+          <w:b w:val="0"/>
+          <w:sz w:val="18"/>
+        </w:rPr>
+        <w:t>We aggregate NOAA hail, flash-flood and flood records from 2010–2025 into Copart fiscal quarters. Each FY2025 count is compared with the median for the same quarter number across 63 complete quarters, including FY2025. Percentage deviation equals 100 times (count divided by median minus one). This retrospective comparison uses revised data and does not estimate insured losses or Copart financial outcomes.</w:t>
       </w:r>
     </w:p>
     <w:p>

</xml_diff>

<commit_message>
Add tested forward weather outlook and clear chart legends
</commit_message>
<xml_diff>
--- a/docs/copart-research-report.docx
+++ b/docs/copart-research-report.docx
@@ -165,7 +165,7 @@
         <w:pStyle w:val="Heading1"/>
       </w:pPr>
       <w:r>
-        <w:t>Weather evidence and the predictive question</w:t>
+        <w:t>Historical evidence and forward weather forecast</w:t>
       </w:r>
     </w:p>
     <w:p>
@@ -183,7 +183,7 @@
           <w:b w:val="0"/>
           <w:sz w:val="18"/>
         </w:rPr>
-        <w:t>The figure describes historical U.S. weather records aligned to Copart’s fiscal calendar. It does not forecast future weather or establish changes in Copart revenue, volumes or earnings. It is not weighted by Copart’s footprint or insured-vehicle exposure, and it does not represent all catastrophe types or international operations.</w:t>
+        <w:t>Historical context: FY2025 flash-flood records exceeded the seasonal median in all four quarters, while hail and flood records were below median in three quarters. The forward forecast below estimates U.S. event-record counts for FY2027 Q2–Q4 as of September 30, 2026. It does not estimate Copart revenue or insured losses and is not weighted by vehicle exposure or Copart’s footprint.</w:t>
       </w:r>
     </w:p>
     <w:p>
@@ -194,8 +194,8 @@
       <w:r>
         <w:drawing>
           <wp:inline xmlns:a="http://schemas.openxmlformats.org/drawingml/2006/main" xmlns:pic="http://schemas.openxmlformats.org/drawingml/2006/picture">
-            <wp:extent cx="5577840" cy="4685386"/>
-            <wp:docPr id="1" name="Picture 1" descr="Three horizontal bar charts show FY2025 weather deviations. All four flash-flood quarters are above median; three hail and flood quarters are below. Calendar months label each quarter."/>
+            <wp:extent cx="6400800" cy="3316778"/>
+            <wp:docPr id="1" name="Picture 1" descr="Three panels forecast hail, flash-flood and flood records for FY2027 Q2 through Q4. Blue dots show point forecasts and vertical lines show historical error ranges. Seasonal median forecasts are selected for all categories."/>
             <wp:cNvGraphicFramePr>
               <a:graphicFrameLocks noChangeAspect="1"/>
             </wp:cNvGraphicFramePr>
@@ -203,7 +203,7 @@
               <a:graphicData uri="http://schemas.openxmlformats.org/drawingml/2006/picture">
                 <pic:pic>
                   <pic:nvPicPr>
-                    <pic:cNvPr id="0" name="05-simple-weather-comparison.png"/>
+                    <pic:cNvPr id="0" name="06-predictive-weather.png"/>
                     <pic:cNvPicPr/>
                   </pic:nvPicPr>
                   <pic:blipFill>
@@ -215,7 +215,7 @@
                   <pic:spPr>
                     <a:xfrm>
                       <a:off x="0" y="0"/>
-                      <a:ext cx="5577840" cy="4685386"/>
+                      <a:ext cx="6400800" cy="3316778"/>
                     </a:xfrm>
                     <a:prstGeom prst="rect"/>
                   </pic:spPr>
@@ -232,7 +232,7 @@
           <w:b w:val="0"/>
           <w:sz w:val="16"/>
         </w:rPr>
-        <w:t>Figure 1. FY2025 weather records versus seasonal medians. Zero means the historical median; positive bars mean more records, negative bars fewer.</w:t>
+        <w:t>Figure 1. Forward forecasts with historical error ranges. Dots are forecasts; vertical whiskers show uncertainty estimated from development-period errors. Panel scales differ.</w:t>
       </w:r>
     </w:p>
     <w:p>
@@ -249,7 +249,33 @@
           <w:b w:val="0"/>
           <w:sz w:val="18"/>
         </w:rPr>
-        <w:t>We aggregate NOAA hail, flash-flood and flood records from 2010–2025 into Copart fiscal quarters. Each FY2025 count is compared with the median for the same quarter number across 63 complete quarters, including FY2025. Percentage deviation equals 100 times (count divided by median minus one). This retrospective comparison uses revised data and does not estimate insured losses or Copart financial outcomes.</w:t>
+        <w:t>We compare a seasonal-median forecast with fixed-penalty ridge regression using seasonal indicators and a time trend. Each September forecast uses data only through the previous December, matching the current data gap. Model selection uses 21 predictions per category from September 2015–2021 origins. The September 2022 origin is excluded from selection to keep its outcomes out of the first holdout information set. September 2023 and 2024 origins provide six held-out quarters per category, spanning FY2024 and FY2025 Q2–Q4. Revised NOAA data prevent a true historical-vintage test.</w:t>
+      </w:r>
+    </w:p>
+    <w:p>
+      <w:r>
+        <w:rPr>
+          <w:b w:val="0"/>
+          <w:sz w:val="18"/>
+        </w:rPr>
+        <w:t>The seasonal median wins model selection for all three categories. Held-out mean absolute errors are 307 hail records, 449 flash-flood records and 187 flood records, versus 1,297, 535 and 145 for ridge regression. Ridge improves the flood holdout result but was not selected using that holdout. Historical error ranges target 80% coverage; observed coverage is 100%, 67% and 100%, respectively, on only six tests each. Forward coverage is not guaranteed.</w:t>
+      </w:r>
+    </w:p>
+    <w:p>
+      <w:pPr>
+        <w:pStyle w:val="Heading1"/>
+      </w:pPr>
+      <w:r>
+        <w:t>Implication for the investment thesis</w:t>
+      </w:r>
+    </w:p>
+    <w:p>
+      <w:r>
+        <w:rPr>
+          <w:b w:val="0"/>
+          <w:sz w:val="18"/>
+        </w:rPr>
+        <w:t>This adds a genuine forward weather component, but it does not establish predictive support for the stock recommendation. The evidence favors a seasonal weather baseline, not a demonstrated ML advantage or revenue uplift. Keep weather effects out of the base-case revenue forecast until lagged weather improves out-of-sample Copart forecasts. Test service revenue or assignments against a financial-only baseline, then translate supported changes through the separate Excel model’s costs, cash flows and valuation. Four annual financial observations cannot validate that relationship.</w:t>
       </w:r>
     </w:p>
     <w:p>
@@ -259,7 +285,7 @@
           <w:color w:val="895824"/>
           <w:sz w:val="16"/>
         </w:rPr>
-        <w:t>[Predictive evidence: justify forward business assumptions in the separate financial model and explain their valuation impact. If adding a weather prediction, report the target, test periods and error versus a baseline. Four annual observations are insufficient for the planned weather evaluation; no weather earnings uplift is validated.]</w:t>
+        <w:t>[Team completion: state the operating forecast, forecast period, evidence for the assumption, difference from a sourced market expectation, and resulting valuation/return. Without this financial link, the weather forecast alone is insufficient evidence for the investment thesis.]</w:t>
       </w:r>
     </w:p>
     <w:p>
@@ -268,7 +294,7 @@
           <w:b w:val="0"/>
           <w:sz w:val="16"/>
         </w:rPr>
-        <w:t>Source: NOAA Storm Events revised 2010–2025 snapshots, U.S. states/DC; ncei.noaa.gov/pub/data/swdi/stormevents/csvfiles/. Figures are the original Python-generated PNGs. Counts are event records, not unique storms or insured losses. Historical publication vintages are not reconstructed.</w:t>
+        <w:t>Source: NOAA Storm Events revised 2010–2025 snapshots, U.S. states/DC; ncei.noaa.gov/pub/data/swdi/stormevents/csvfiles/. Latest complete training quarter ends October 2025; no 2026 weather is used. Original Python PNG embedded. Reproducible forecast values and test results: docs/figures/06-weather-forecast.csv and 06-weather-forecast-report.json. Counts are records, not unique storms or losses.</w:t>
       </w:r>
     </w:p>
     <w:p>

</xml_diff>